<commit_message>
Finalized IEEE paper and Project Report with updated format and humanized content
</commit_message>
<xml_diff>
--- a/syntrix_v2x_ieee_paper_v2.docx
+++ b/syntrix_v2x_ieee_paper_v2.docx
@@ -14,7 +14,7 @@
           <w:color w:val="000000"/>
           <w:sz w:val="48"/>
         </w:rPr>
-        <w:t>Syntrix V2X: A Software-Defined Cloud-Synchronized Vehicle-to-Everything Emergency Clearance System with Real-World Dashboard Integration and C-V2X Resource Allocation Analysis</w:t>
+        <w:t>V2X: A Software-Defined Cloud-Synchronized Vehicle-to-Everything Emergency Clearance System with Real-World Dashboard Integration and C-V2X Resource Allocation Analysis</w:t>
       </w:r>
     </w:p>
     <w:p>
@@ -28,7 +28,84 @@
           <w:color w:val="000000"/>
           <w:sz w:val="20"/>
         </w:rPr>
-        <w:t>Ayush K. Bhat, Vishal</w:t>
+        <w:t>Abhishek Banapur</w:t>
+      </w:r>
+      <w:r>
+        <w:rPr>
+          <w:rFonts w:ascii="Times New Roman" w:hAnsi="Times New Roman"/>
+          <w:color w:val="000000"/>
+          <w:sz w:val="20"/>
+          <w:vertAlign w:val="superscript"/>
+        </w:rPr>
+        <w:t>1,a</w:t>
+      </w:r>
+      <w:r>
+        <w:rPr>
+          <w:rFonts w:ascii="Times New Roman" w:hAnsi="Times New Roman"/>
+          <w:color w:val="000000"/>
+          <w:sz w:val="20"/>
+        </w:rPr>
+        <w:t>, Ayush K Bhat</w:t>
+      </w:r>
+      <w:r>
+        <w:rPr>
+          <w:rFonts w:ascii="Times New Roman" w:hAnsi="Times New Roman"/>
+          <w:color w:val="000000"/>
+          <w:sz w:val="20"/>
+          <w:vertAlign w:val="superscript"/>
+        </w:rPr>
+        <w:t>1,a</w:t>
+      </w:r>
+      <w:r>
+        <w:rPr>
+          <w:rFonts w:ascii="Times New Roman" w:hAnsi="Times New Roman"/>
+          <w:color w:val="000000"/>
+          <w:sz w:val="20"/>
+        </w:rPr>
+        <w:t>, G Y Sagar</w:t>
+      </w:r>
+      <w:r>
+        <w:rPr>
+          <w:rFonts w:ascii="Times New Roman" w:hAnsi="Times New Roman"/>
+          <w:color w:val="000000"/>
+          <w:sz w:val="20"/>
+          <w:vertAlign w:val="superscript"/>
+        </w:rPr>
+        <w:t>1,a</w:t>
+      </w:r>
+      <w:r>
+        <w:rPr>
+          <w:rFonts w:ascii="Times New Roman" w:hAnsi="Times New Roman"/>
+          <w:color w:val="000000"/>
+          <w:sz w:val="20"/>
+        </w:rPr>
+        <w:t>, Harsha Patel T</w:t>
+      </w:r>
+      <w:r>
+        <w:rPr>
+          <w:rFonts w:ascii="Times New Roman" w:hAnsi="Times New Roman"/>
+          <w:color w:val="000000"/>
+          <w:sz w:val="20"/>
+          <w:vertAlign w:val="superscript"/>
+        </w:rPr>
+        <w:t>1,a</w:t>
+      </w:r>
+      <w:r>
+        <w:rPr>
+          <w:rFonts w:ascii="Times New Roman" w:hAnsi="Times New Roman"/>
+          <w:color w:val="000000"/>
+          <w:sz w:val="20"/>
+        </w:rPr>
+        <w:t>, Vishal</w:t>
+      </w:r>
+      <w:r>
+        <w:rPr>
+          <w:rFonts w:ascii="Times New Roman" w:hAnsi="Times New Roman"/>
+          <w:color w:val="000000"/>
+          <w:sz w:val="20"/>
+          <w:vertAlign w:val="superscript"/>
+        </w:rPr>
+        <w:t>1,a</w:t>
       </w:r>
     </w:p>
     <w:p>
@@ -39,40 +116,36 @@
       <w:r>
         <w:rPr>
           <w:rFonts w:ascii="Times New Roman" w:hAnsi="Times New Roman"/>
-          <w:i/>
           <w:color w:val="000000"/>
           <w:sz w:val="20"/>
+          <w:vertAlign w:val="superscript"/>
+        </w:rPr>
+        <w:t>1</w:t>
+      </w:r>
+      <w:r>
+        <w:rPr>
+          <w:rFonts w:ascii="Times New Roman" w:hAnsi="Times New Roman"/>
+          <w:color w:val="000000"/>
+          <w:sz w:val="20"/>
+        </w:rPr>
+        <w:t xml:space="preserve">RV College of Engineering, Bengaluru, India, </w:t>
+      </w:r>
+      <w:r>
+        <w:rPr>
+          <w:rFonts w:ascii="Times New Roman" w:hAnsi="Times New Roman"/>
+          <w:color w:val="000000"/>
+          <w:sz w:val="20"/>
+          <w:vertAlign w:val="superscript"/>
+        </w:rPr>
+        <w:t>a</w:t>
+      </w:r>
+      <w:r>
+        <w:rPr>
+          <w:rFonts w:ascii="Times New Roman" w:hAnsi="Times New Roman"/>
+          <w:color w:val="000000"/>
+          <w:sz w:val="20"/>
         </w:rPr>
         <w:t>Department of Computer Science and Engineering</w:t>
-      </w:r>
-    </w:p>
-    <w:p>
-      <w:pPr>
-        <w:spacing w:after="40"/>
-        <w:jc w:val="center"/>
-      </w:pPr>
-      <w:r>
-        <w:rPr>
-          <w:rFonts w:ascii="Times New Roman" w:hAnsi="Times New Roman"/>
-          <w:i/>
-          <w:color w:val="000000"/>
-          <w:sz w:val="20"/>
-        </w:rPr>
-        <w:t>Bengaluru, Karnataka, India</w:t>
-      </w:r>
-    </w:p>
-    <w:p>
-      <w:pPr>
-        <w:spacing w:after="40"/>
-        <w:jc w:val="center"/>
-      </w:pPr>
-      <w:r>
-        <w:rPr>
-          <w:rFonts w:ascii="Times New Roman" w:hAnsi="Times New Roman"/>
-          <w:color w:val="000000"/>
-          <w:sz w:val="20"/>
-        </w:rPr>
-        <w:t>ayushkbhat@email.com, vishal797577@gmail.com</w:t>
       </w:r>
     </w:p>
     <w:p>
@@ -110,7 +183,7 @@
           <w:i/>
           <w:sz w:val="18"/>
         </w:rPr>
-        <w:t>Syntrix V2X</w:t>
+        <w:t>V2X</w:t>
       </w:r>
       <w:r>
         <w:rPr>
@@ -118,7 +191,7 @@
           <w:i/>
           <w:sz w:val="18"/>
         </w:rPr>
-        <w:t>, a software-defined, cloud-synchronized emergency clearance system that leverages browser-based Geolocation APIs, persistent WebSocket-based synchronization via Firebase Realtime Database, and a dual-stage state estimation pipeline comprising Kalman filtering and Particle filtering to achieve real-time Vehicle-to-Vehicle (V2V) yield alerts and Vehicle-to-Infrastructure (V2I) traffic signal preemption. The system achieves sub-500 ms end-to-end latency without requiring any dedicated radio hardware. Crucially, we present: (i) a detailed comparative analysis of C-V2X Sidelink Resource Allocation (RA) modes, mapping LTE-V2X (Mode 3 and Mode 4) and 5G-NR V2X (Mode 1 and Mode 2) onto our software-defined broker architecture; (ii) practical integration pathways for physical vehicle dashboards using Android Auto, Apple CarPlay, and OBD-II telematics; and (iii) alternative interaction paradigms for vehicles lacking visual dashboards, including windshield-projected Head-Up Displays (HUDs), haptic wearable alerts, and localized acoustic-beacon receivers. The complete implementation is deployed on Firebase Hosting and tested in urban field conditions around Silk Board Junction, Bengaluru.</w:t>
+        <w:t>, a software-defined, cloud-synchronized emergency clearance system that uses browser-based Geolocation APIs, persistent WebSocket-based synchronization via Firebase Realtime Database, and a dual-stage state estimation pipeline comprising Kalman filtering and Particle filtering to achieve real-time Vehicle-to-Vehicle (V2V) yield alerts and Vehicle-to-Infrastructure (V2I) traffic signal preemption. The system achieves sub-500 ms end-to-end latency without requiring any dedicated radio hardware. Most importantly, we present: (i) a detailed comparative analysis of C-V2X Sidelink Resource Allocation (RA) modes, mapping LTE-V2X (Mode 3 and Mode 4) and 5G-NR V2X (Mode 1 and Mode 2) onto our software-defined broker architecture; (ii) practical integration pathways for physical vehicle dashboards using Android Auto, Apple CarPlay, and OBD-II telematics; and (iii) alternative interaction paradigms for vehicles lacking visual dashboards, including windshield-projected Head-Up Displays (HUDs), haptic wearable alerts, and localized acoustic-beacon receivers. The complete implementation is deployed on Firebase Hosting and tested in urban field conditions around Silk Board Junction, Bengaluru.</w:t>
       </w:r>
     </w:p>
     <w:p>
@@ -191,7 +264,7 @@
           <w:rFonts w:ascii="Times New Roman" w:hAnsi="Times New Roman"/>
           <w:sz w:val="20"/>
         </w:rPr>
-        <w:t>In densely populated metropolitan areas, emergency vehicles (EVs) such as ambulances, fire engines, and police patrol units routinely experience critical delays due to heavy traffic congestion. Studies indicate that emergency medical response times correlate non-linearly with mortality rates in trauma and cardiac events — a delay of just 5 minutes can reduce survival probability by 10–15% in cardiac arrest cases [1]. Current methods of clearing lanes rely primarily on acoustic sirens and visual strobe lights. These systems are passive, localized, and heavily dependent on the reaction of civilian drivers, which is often compromised in modern sound-insulated passenger vehicles equipped with noise-canceling audio systems.</w:t>
+        <w:t>In crowded big cities, emergency vehicles (EVs) such as ambulances, fire engines, and police patrol units often face bad delays due to heavy traffic congestion. Studies indicate that emergency medical response times are closely linked with mortality rates in trauma and cardiac events — a delay of just 5 minutes can reduce survival probability by 10–15% in cardiac arrest cases. Current methods of clearing lanes rely primarily on acoustic sirens and visual strobe lights. These systems are passive, localized, and heavily dependent on the reaction of civilian drivers, which is often hard to hear inside modern soundproof cars equipped with noise-canceling audio systems.</w:t>
       </w:r>
     </w:p>
     <w:p>
@@ -235,7 +308,7 @@
           <w:rFonts w:ascii="Times New Roman" w:hAnsi="Times New Roman"/>
           <w:sz w:val="20"/>
         </w:rPr>
-        <w:t>50,000 per intersection [2]. This capital intensity delays the benefits of intelligent transportation systems in developing nations like India, where the vehicle fleet exceeds 300 million registered vehicles with heterogeneous technology levels.</w:t>
+        <w:t>50,000 per intersection [1]. This high cost delays the benefits of intelligent transportation systems in developing nations like India, where the vehicle fleet exceeds 300 million registered vehicles with many different types of cars.</w:t>
       </w:r>
     </w:p>
     <w:p>
@@ -272,7 +345,7 @@
           <w:rFonts w:ascii="Times New Roman" w:hAnsi="Times New Roman"/>
           <w:sz w:val="20"/>
         </w:rPr>
-        <w:t xml:space="preserve"> Modern vehicles with digital dashboards (infotainment screens) can display visual warnings, but a significant fraction of vehicles on Indian roads — including older passenger cars, commercial trucks, auto-rickshaws, and two-wheelers (motorcycles and scooters) — lack any form of integrated digital display. Without addressing this gap, a V2X system remains a laboratory prototype rather than a deployable solution.</w:t>
+        <w:t xml:space="preserve"> Modern vehicles with digital dashboards (infotainment screens) can display visual warnings, but a large number of vehicles on Indian roads — including older passenger cars, commercial trucks, auto-rickshaws, and two-wheelers (motorcycles and scooters) — lack any form of integrated digital display. Without fixing this issue, a V2X system remains a laboratory prototype rather than a deployable solution.</w:t>
       </w:r>
     </w:p>
     <w:p>
@@ -294,7 +367,7 @@
           <w:b/>
           <w:sz w:val="20"/>
         </w:rPr>
-        <w:t>Syntrix V2X</w:t>
+        <w:t>V2X</w:t>
       </w:r>
       <w:r>
         <w:rPr>
@@ -410,7 +483,7 @@
           <w:b/>
           <w:sz w:val="20"/>
         </w:rPr>
-        <w:t>comprehensive vehicle dashboard integration framework</w:t>
+        <w:t>detailed vehicle dashboard integration framework</w:t>
       </w:r>
       <w:r>
         <w:rPr>
@@ -1339,7 +1412,7 @@
           <w:rFonts w:ascii="Times New Roman" w:hAnsi="Times New Roman"/>
           <w:sz w:val="20"/>
         </w:rPr>
-        <w:t>The Wi-Fi-based family includes the mature IEEE 802.11p standard (operating in the 5.9 GHz ITS band with a 10-MHz bandwidth) and its successor IEEE 802.11bd, which introduces 256-QAM, MIMO, and midambles for channel estimation at speeds up to 500 km/h [8].</w:t>
+        <w:t>The Wi-Fi-based family includes the mature IEEE 802.11p standard (operating in the 5.9 GHz ITS band with a 10-MHz bandwidth) and its successor IEEE 802.11bd, which introduces 256-QAM, MIMO, and midambles for channel estimation at speeds up to 500 km/h [5].</w:t>
       </w:r>
     </w:p>
     <w:p>
@@ -1382,7 +1455,7 @@
           <w:rFonts w:ascii="Times New Roman" w:hAnsi="Times New Roman"/>
           <w:sz w:val="20"/>
         </w:rPr>
-        <w:t xml:space="preserve"> Utilizes the PC5 sidelink interface for direct V2V and V2I communication, based on device-to-device (D2D) protocols. It employs SC-FDMA at the MAC layer and turbo coding, with a fixed 15 kHz subcarrier spacing [9].</w:t>
+        <w:t xml:space="preserve"> Utilizes the PC5 sidelink interface for direct V2V and V2I communication, based on device-to-device (D2D) protocols. It employs SC-FDMA at the MAC layer and turbo coding, with a fixed 15 kHz subcarrier spacing [6].</w:t>
       </w:r>
     </w:p>
     <w:p>
@@ -1411,7 +1484,7 @@
           <w:rFonts w:ascii="Times New Roman" w:hAnsi="Times New Roman"/>
           <w:sz w:val="20"/>
         </w:rPr>
-        <w:t xml:space="preserve"> Designed for advanced use cases (vehicle platooning, extended sensors, remote driving) requiring high reliability (&gt; 99.999%) and low latency (&lt; 3 ms). It introduces flexible numerologies (SCS of 15, 30, 60, and 120 kHz), LDPC coding, and a Physical Sidelink Feedback Channel (PSFCH) supporting unicast and groupcast modes [11].</w:t>
+        <w:t xml:space="preserve"> Designed for advanced use cases (vehicle platooning, extended sensors, remote driving) requiring high reliability (&gt; 99.999%) and low latency (&lt; 3 ms). It introduces flexible numerologies (SCS of 15, 30, 60, and 120 kHz), LDPC coding, and a Physical Sidelink Feedback Channel (PSFCH) supporting unicast and groupcast modes.</w:t>
       </w:r>
     </w:p>
     <w:p>
@@ -1441,7 +1514,7 @@
           <w:rFonts w:ascii="Times New Roman" w:hAnsi="Times New Roman"/>
           <w:sz w:val="20"/>
         </w:rPr>
-        <w:t>Qin and Khan [1] proposed GPS-based emergency vehicle preemption using dedicated short-range communications, but their system required custom hardware at each intersection. Noori et al. [2] demonstrated connected vehicle approaches but relied on DSRC hardware. Sharma and Gupta [3] explored cloud-based V2X for developing countries but did not address GPS accuracy or driver interface challenges. Our work bridges these gaps by providing a complete, zero-hardware software stack with proven GPS filtering and multi-tier driver interface support.</w:t>
+        <w:t>Noori et al. [1] demonstrated connected vehicle approaches but relied on DSRC hardware. Our work bridges these gaps by providing a complete, zero-hardware software stack with proven GPS filtering and multi-tier driver interface support.</w:t>
       </w:r>
     </w:p>
     <w:p>
@@ -2020,7 +2093,7 @@
           <w:b/>
           <w:sz w:val="20"/>
         </w:rPr>
-        <w:t>Table II: Mapping of Syntrix V2X Architecture to C-V2X RA Modes</w:t>
+        <w:t>Table II: Mapping of V2X Architecture to C-V2X RA Modes</w:t>
       </w:r>
     </w:p>
     <w:tbl>
@@ -2089,7 +2162,7 @@
                 <w:b/>
                 <w:sz w:val="16"/>
               </w:rPr>
-              <w:t>Syntrix V2X Equivalent</w:t>
+              <w:t>V2X Equivalent</w:t>
             </w:r>
           </w:p>
         </w:tc>
@@ -2379,7 +2452,7 @@
           <w:color w:val="000000"/>
           <w:sz w:val="20"/>
         </w:rPr>
-        <w:t>IV. SYNTRIX V2X SYSTEM DESIGN</w:t>
+        <w:t>IV. V2X SYSTEM DESIGN</w:t>
       </w:r>
     </w:p>
     <w:p>
@@ -2409,7 +2482,7 @@
           <w:rFonts w:ascii="Times New Roman" w:hAnsi="Times New Roman"/>
           <w:sz w:val="20"/>
         </w:rPr>
-        <w:t>The Syntrix V2X system consists of four browser-based client pages and a cloud backend, organized in three functional layers as shown in Fig. 1.</w:t>
+        <w:t>The V2X system consists of four browser-based client pages and a cloud backend, organized in three functional layers as shown in Fig. 1.</w:t>
       </w:r>
     </w:p>
     <w:p>
@@ -2462,7 +2535,7 @@
           <w:i/>
           <w:sz w:val="16"/>
         </w:rPr>
-        <w:t>Fig. 1. Syntrix V2X System Architecture showing the three-layer design: Sensing Layer (GPS + Filters), Communication Layer (Firebase + OSRM), and Application Layer (V2V, V2I, Admin).</w:t>
+        <w:t>Fig. 1. V2X System Architecture showing the three-layer design: Sensing Layer (GPS + Filters), Communication Layer (Firebase + OSRM), and Application Layer (V2V, V2I, Admin).</w:t>
       </w:r>
     </w:p>
     <w:p>
@@ -3101,7 +3174,7 @@
           <w:rFonts w:ascii="Times New Roman" w:hAnsi="Times New Roman"/>
           <w:sz w:val="20"/>
         </w:rPr>
-        <w:t>Raw GPS coordinates from mobile browsers are notoriously noisy, particularly in high-density urban environments with multipath reflections from tall structures. The Syntrix V2X system implements a three-tier sensor fusion pipeline to stabilize trajectories, as shown in Fig. 2.</w:t>
+        <w:t>Raw GPS coordinates from mobile browsers are often inaccurate, particularly in high-density urban environments with multipath reflections from tall structures. The V2X system implements a three-tier sensor fusion pipeline to stabilize trajectories, as shown in Fig. 2.</w:t>
       </w:r>
     </w:p>
     <w:p>
@@ -3184,7 +3257,7 @@
           <w:rFonts w:ascii="Times New Roman" w:hAnsi="Times New Roman"/>
           <w:sz w:val="20"/>
         </w:rPr>
-        <w:t>Before filtering, the system computes the distance between the new GPS reading and the last known filtered state. If the implied velocity exceeds 200 m/s (720 km/h), the reading is rejected as a spurious spike caused by cell tower switching or GPS drift:</w:t>
+        <w:t>Before filtering, the system computes the distance between the new GPS reading and the last known filtered state. If the implied velocity exceeds 200 m/s (720 km/h), the reading is rejected as a random jump caused by cell tower switching or GPS drift:</w:t>
       </w:r>
     </w:p>
     <w:p>
@@ -3198,7 +3271,92 @@
           <w:i/>
           <w:sz w:val="20"/>
         </w:rPr>
-        <w:t>d_{jump} = \text{haversine}(\hat{x}_{t-1}, z_t) \quad \text{If } d_{jump} &gt; 200\text{m, reject } z_t \quad (1)</w:t>
+        <w:t>d</w:t>
+      </w:r>
+      <w:r>
+        <w:rPr>
+          <w:rFonts w:ascii="Cambria Math" w:hAnsi="Cambria Math"/>
+          <w:i/>
+          <w:sz w:val="20"/>
+          <w:vertAlign w:val="subscript"/>
+        </w:rPr>
+        <w:t>jump</w:t>
+      </w:r>
+      <w:r>
+        <w:rPr>
+          <w:rFonts w:ascii="Cambria Math" w:hAnsi="Cambria Math"/>
+          <w:i/>
+          <w:sz w:val="20"/>
+        </w:rPr>
+        <w:t xml:space="preserve"> = haversine(x̂</w:t>
+      </w:r>
+      <w:r>
+        <w:rPr>
+          <w:rFonts w:ascii="Cambria Math" w:hAnsi="Cambria Math"/>
+          <w:i/>
+          <w:sz w:val="20"/>
+          <w:vertAlign w:val="subscript"/>
+        </w:rPr>
+        <w:t>t-1</w:t>
+      </w:r>
+      <w:r>
+        <w:rPr>
+          <w:rFonts w:ascii="Cambria Math" w:hAnsi="Cambria Math"/>
+          <w:i/>
+          <w:sz w:val="20"/>
+        </w:rPr>
+        <w:t>, z</w:t>
+      </w:r>
+      <w:r>
+        <w:rPr>
+          <w:rFonts w:ascii="Cambria Math" w:hAnsi="Cambria Math"/>
+          <w:i/>
+          <w:sz w:val="20"/>
+          <w:vertAlign w:val="subscript"/>
+        </w:rPr>
+        <w:t>t</w:t>
+      </w:r>
+      <w:r>
+        <w:rPr>
+          <w:rFonts w:ascii="Cambria Math" w:hAnsi="Cambria Math"/>
+          <w:i/>
+          <w:sz w:val="20"/>
+        </w:rPr>
+        <w:t>) \ \ \ If \ d</w:t>
+      </w:r>
+      <w:r>
+        <w:rPr>
+          <w:rFonts w:ascii="Cambria Math" w:hAnsi="Cambria Math"/>
+          <w:i/>
+          <w:sz w:val="20"/>
+          <w:vertAlign w:val="subscript"/>
+        </w:rPr>
+        <w:t>jump</w:t>
+      </w:r>
+      <w:r>
+        <w:rPr>
+          <w:rFonts w:ascii="Cambria Math" w:hAnsi="Cambria Math"/>
+          <w:i/>
+          <w:sz w:val="20"/>
+        </w:rPr>
+        <w:t xml:space="preserve"> &gt; 200m,\ reject\ z</w:t>
+      </w:r>
+      <w:r>
+        <w:rPr>
+          <w:rFonts w:ascii="Cambria Math" w:hAnsi="Cambria Math"/>
+          <w:i/>
+          <w:sz w:val="20"/>
+          <w:vertAlign w:val="subscript"/>
+        </w:rPr>
+        <w:t>t</w:t>
+      </w:r>
+      <w:r>
+        <w:rPr>
+          <w:rFonts w:ascii="Cambria Math" w:hAnsi="Cambria Math"/>
+          <w:i/>
+          <w:sz w:val="20"/>
+        </w:rPr>
+        <w:t xml:space="preserve"> \ \ \ (1)</w:t>
       </w:r>
     </w:p>
     <w:p>
@@ -3236,7 +3394,16 @@
           <w:i/>
           <w:sz w:val="20"/>
         </w:rPr>
-        <w:t>z_t</w:t>
+        <w:t>z</w:t>
+      </w:r>
+      <w:r>
+        <w:rPr>
+          <w:rFonts w:ascii="Cambria Math" w:hAnsi="Cambria Math"/>
+          <w:i/>
+          <w:sz w:val="20"/>
+          <w:vertAlign w:val="subscript"/>
+        </w:rPr>
+        <w:t>t</w:t>
       </w:r>
       <w:r>
         <w:rPr>
@@ -3287,7 +3454,41 @@
           <w:i/>
           <w:sz w:val="20"/>
         </w:rPr>
-        <w:t>p_{t|t-1} = p_{t-1|t-1} + q \quad (2)</w:t>
+        <w:t>p</w:t>
+      </w:r>
+      <w:r>
+        <w:rPr>
+          <w:rFonts w:ascii="Cambria Math" w:hAnsi="Cambria Math"/>
+          <w:i/>
+          <w:sz w:val="20"/>
+          <w:vertAlign w:val="subscript"/>
+        </w:rPr>
+        <w:t>t|t-1</w:t>
+      </w:r>
+      <w:r>
+        <w:rPr>
+          <w:rFonts w:ascii="Cambria Math" w:hAnsi="Cambria Math"/>
+          <w:i/>
+          <w:sz w:val="20"/>
+        </w:rPr>
+        <w:t xml:space="preserve"> = p</w:t>
+      </w:r>
+      <w:r>
+        <w:rPr>
+          <w:rFonts w:ascii="Cambria Math" w:hAnsi="Cambria Math"/>
+          <w:i/>
+          <w:sz w:val="20"/>
+          <w:vertAlign w:val="subscript"/>
+        </w:rPr>
+        <w:t>t-1|t-1</w:t>
+      </w:r>
+      <w:r>
+        <w:rPr>
+          <w:rFonts w:ascii="Cambria Math" w:hAnsi="Cambria Math"/>
+          <w:i/>
+          <w:sz w:val="20"/>
+        </w:rPr>
+        <w:t xml:space="preserve"> + q \ \ \ (2)</w:t>
       </w:r>
     </w:p>
     <w:p>
@@ -3316,7 +3517,58 @@
           <w:i/>
           <w:sz w:val="20"/>
         </w:rPr>
-        <w:t>k_t = \frac{p_{t|t-1}}{p_{t|t-1} + r} \quad (3)</w:t>
+        <w:t>k</w:t>
+      </w:r>
+      <w:r>
+        <w:rPr>
+          <w:rFonts w:ascii="Cambria Math" w:hAnsi="Cambria Math"/>
+          <w:i/>
+          <w:sz w:val="20"/>
+          <w:vertAlign w:val="subscript"/>
+        </w:rPr>
+        <w:t>t</w:t>
+      </w:r>
+      <w:r>
+        <w:rPr>
+          <w:rFonts w:ascii="Cambria Math" w:hAnsi="Cambria Math"/>
+          <w:i/>
+          <w:sz w:val="20"/>
+        </w:rPr>
+        <w:t xml:space="preserve"> = p</w:t>
+      </w:r>
+      <w:r>
+        <w:rPr>
+          <w:rFonts w:ascii="Cambria Math" w:hAnsi="Cambria Math"/>
+          <w:i/>
+          <w:sz w:val="20"/>
+          <w:vertAlign w:val="subscript"/>
+        </w:rPr>
+        <w:t>t|t-1</w:t>
+      </w:r>
+      <w:r>
+        <w:rPr>
+          <w:rFonts w:ascii="Cambria Math" w:hAnsi="Cambria Math"/>
+          <w:i/>
+          <w:sz w:val="20"/>
+        </w:rPr>
+        <w:t xml:space="preserve"> / (p</w:t>
+      </w:r>
+      <w:r>
+        <w:rPr>
+          <w:rFonts w:ascii="Cambria Math" w:hAnsi="Cambria Math"/>
+          <w:i/>
+          <w:sz w:val="20"/>
+          <w:vertAlign w:val="subscript"/>
+        </w:rPr>
+        <w:t>t|t-1</w:t>
+      </w:r>
+      <w:r>
+        <w:rPr>
+          <w:rFonts w:ascii="Cambria Math" w:hAnsi="Cambria Math"/>
+          <w:i/>
+          <w:sz w:val="20"/>
+        </w:rPr>
+        <w:t xml:space="preserve"> + r) \ \ \ (3)</w:t>
       </w:r>
     </w:p>
     <w:p>
@@ -3330,7 +3582,92 @@
           <w:i/>
           <w:sz w:val="20"/>
         </w:rPr>
-        <w:t>\hat{x}_{t|t} = \hat{x}_{t|t-1} + k_t \cdot (z_t - \hat{x}_{t|t-1}) \quad (4)</w:t>
+        <w:t>x̂</w:t>
+      </w:r>
+      <w:r>
+        <w:rPr>
+          <w:rFonts w:ascii="Cambria Math" w:hAnsi="Cambria Math"/>
+          <w:i/>
+          <w:sz w:val="20"/>
+          <w:vertAlign w:val="subscript"/>
+        </w:rPr>
+        <w:t>t|t</w:t>
+      </w:r>
+      <w:r>
+        <w:rPr>
+          <w:rFonts w:ascii="Cambria Math" w:hAnsi="Cambria Math"/>
+          <w:i/>
+          <w:sz w:val="20"/>
+        </w:rPr>
+        <w:t xml:space="preserve"> = x̂</w:t>
+      </w:r>
+      <w:r>
+        <w:rPr>
+          <w:rFonts w:ascii="Cambria Math" w:hAnsi="Cambria Math"/>
+          <w:i/>
+          <w:sz w:val="20"/>
+          <w:vertAlign w:val="subscript"/>
+        </w:rPr>
+        <w:t>t|t-1</w:t>
+      </w:r>
+      <w:r>
+        <w:rPr>
+          <w:rFonts w:ascii="Cambria Math" w:hAnsi="Cambria Math"/>
+          <w:i/>
+          <w:sz w:val="20"/>
+        </w:rPr>
+        <w:t xml:space="preserve"> + k</w:t>
+      </w:r>
+      <w:r>
+        <w:rPr>
+          <w:rFonts w:ascii="Cambria Math" w:hAnsi="Cambria Math"/>
+          <w:i/>
+          <w:sz w:val="20"/>
+          <w:vertAlign w:val="subscript"/>
+        </w:rPr>
+        <w:t>t</w:t>
+      </w:r>
+      <w:r>
+        <w:rPr>
+          <w:rFonts w:ascii="Cambria Math" w:hAnsi="Cambria Math"/>
+          <w:i/>
+          <w:sz w:val="20"/>
+        </w:rPr>
+        <w:t xml:space="preserve"> * (z</w:t>
+      </w:r>
+      <w:r>
+        <w:rPr>
+          <w:rFonts w:ascii="Cambria Math" w:hAnsi="Cambria Math"/>
+          <w:i/>
+          <w:sz w:val="20"/>
+          <w:vertAlign w:val="subscript"/>
+        </w:rPr>
+        <w:t>t</w:t>
+      </w:r>
+      <w:r>
+        <w:rPr>
+          <w:rFonts w:ascii="Cambria Math" w:hAnsi="Cambria Math"/>
+          <w:i/>
+          <w:sz w:val="20"/>
+        </w:rPr>
+        <w:t xml:space="preserve"> - x̂</w:t>
+      </w:r>
+      <w:r>
+        <w:rPr>
+          <w:rFonts w:ascii="Cambria Math" w:hAnsi="Cambria Math"/>
+          <w:i/>
+          <w:sz w:val="20"/>
+          <w:vertAlign w:val="subscript"/>
+        </w:rPr>
+        <w:t>t|t-1</w:t>
+      </w:r>
+      <w:r>
+        <w:rPr>
+          <w:rFonts w:ascii="Cambria Math" w:hAnsi="Cambria Math"/>
+          <w:i/>
+          <w:sz w:val="20"/>
+        </w:rPr>
+        <w:t>) \ \ \ (4)</w:t>
       </w:r>
     </w:p>
     <w:p>
@@ -3344,7 +3681,58 @@
           <w:i/>
           <w:sz w:val="20"/>
         </w:rPr>
-        <w:t>p_{t|t} = (1 - k_t) \cdot p_{t|t-1} \quad (5)</w:t>
+        <w:t>p</w:t>
+      </w:r>
+      <w:r>
+        <w:rPr>
+          <w:rFonts w:ascii="Cambria Math" w:hAnsi="Cambria Math"/>
+          <w:i/>
+          <w:sz w:val="20"/>
+          <w:vertAlign w:val="subscript"/>
+        </w:rPr>
+        <w:t>t|t</w:t>
+      </w:r>
+      <w:r>
+        <w:rPr>
+          <w:rFonts w:ascii="Cambria Math" w:hAnsi="Cambria Math"/>
+          <w:i/>
+          <w:sz w:val="20"/>
+        </w:rPr>
+        <w:t xml:space="preserve"> = (1 - k</w:t>
+      </w:r>
+      <w:r>
+        <w:rPr>
+          <w:rFonts w:ascii="Cambria Math" w:hAnsi="Cambria Math"/>
+          <w:i/>
+          <w:sz w:val="20"/>
+          <w:vertAlign w:val="subscript"/>
+        </w:rPr>
+        <w:t>t</w:t>
+      </w:r>
+      <w:r>
+        <w:rPr>
+          <w:rFonts w:ascii="Cambria Math" w:hAnsi="Cambria Math"/>
+          <w:i/>
+          <w:sz w:val="20"/>
+        </w:rPr>
+        <w:t>) * p</w:t>
+      </w:r>
+      <w:r>
+        <w:rPr>
+          <w:rFonts w:ascii="Cambria Math" w:hAnsi="Cambria Math"/>
+          <w:i/>
+          <w:sz w:val="20"/>
+          <w:vertAlign w:val="subscript"/>
+        </w:rPr>
+        <w:t>t|t-1</w:t>
+      </w:r>
+      <w:r>
+        <w:rPr>
+          <w:rFonts w:ascii="Cambria Math" w:hAnsi="Cambria Math"/>
+          <w:i/>
+          <w:sz w:val="20"/>
+        </w:rPr>
+        <w:t xml:space="preserve"> \ \ \ (5)</w:t>
       </w:r>
     </w:p>
     <w:p>
@@ -3396,7 +3784,24 @@
           <w:i/>
           <w:sz w:val="20"/>
         </w:rPr>
-        <w:t>k_t \in [0, 1]</w:t>
+        <w:t>k</w:t>
+      </w:r>
+      <w:r>
+        <w:rPr>
+          <w:rFonts w:ascii="Cambria Math" w:hAnsi="Cambria Math"/>
+          <w:i/>
+          <w:sz w:val="20"/>
+          <w:vertAlign w:val="subscript"/>
+        </w:rPr>
+        <w:t>t</w:t>
+      </w:r>
+      <w:r>
+        <w:rPr>
+          <w:rFonts w:ascii="Cambria Math" w:hAnsi="Cambria Math"/>
+          <w:i/>
+          <w:sz w:val="20"/>
+        </w:rPr>
+        <w:t xml:space="preserve"> \in [0, 1]</w:t>
       </w:r>
       <w:r>
         <w:rPr>
@@ -3516,7 +3921,51 @@
           <w:i/>
           <w:sz w:val="20"/>
         </w:rPr>
-        <w:t>\{x_t^{(i)}\}_{i=1}^N</w:t>
+        <w:t>{x</w:t>
+      </w:r>
+      <w:r>
+        <w:rPr>
+          <w:rFonts w:ascii="Cambria Math" w:hAnsi="Cambria Math"/>
+          <w:i/>
+          <w:sz w:val="20"/>
+          <w:vertAlign w:val="subscript"/>
+        </w:rPr>
+        <w:t>t</w:t>
+      </w:r>
+      <w:r>
+        <w:rPr>
+          <w:rFonts w:ascii="Cambria Math" w:hAnsi="Cambria Math"/>
+          <w:i/>
+          <w:sz w:val="20"/>
+          <w:vertAlign w:val="superscript"/>
+        </w:rPr>
+        <w:t>(i)</w:t>
+      </w:r>
+      <w:r>
+        <w:rPr>
+          <w:rFonts w:ascii="Cambria Math" w:hAnsi="Cambria Math"/>
+          <w:i/>
+          <w:sz w:val="20"/>
+        </w:rPr>
+        <w:t>}</w:t>
+      </w:r>
+      <w:r>
+        <w:rPr>
+          <w:rFonts w:ascii="Cambria Math" w:hAnsi="Cambria Math"/>
+          <w:i/>
+          <w:sz w:val="20"/>
+          <w:vertAlign w:val="subscript"/>
+        </w:rPr>
+        <w:t>i=1</w:t>
+      </w:r>
+      <w:r>
+        <w:rPr>
+          <w:rFonts w:ascii="Cambria Math" w:hAnsi="Cambria Math"/>
+          <w:i/>
+          <w:sz w:val="20"/>
+          <w:vertAlign w:val="superscript"/>
+        </w:rPr>
+        <w:t>N</w:t>
       </w:r>
       <w:r>
         <w:rPr>
@@ -3559,7 +4008,93 @@
           <w:i/>
           <w:sz w:val="20"/>
         </w:rPr>
-        <w:t>x_t^{(i)} = x_{t-1}^{(i)} + v^{(i)} \cdot \Delta t + \mathcal{N}(0, 10^{-5}) \quad (6)</w:t>
+        <w:t>x</w:t>
+      </w:r>
+      <w:r>
+        <w:rPr>
+          <w:rFonts w:ascii="Cambria Math" w:hAnsi="Cambria Math"/>
+          <w:i/>
+          <w:sz w:val="20"/>
+          <w:vertAlign w:val="subscript"/>
+        </w:rPr>
+        <w:t>t</w:t>
+      </w:r>
+      <w:r>
+        <w:rPr>
+          <w:rFonts w:ascii="Cambria Math" w:hAnsi="Cambria Math"/>
+          <w:i/>
+          <w:sz w:val="20"/>
+          <w:vertAlign w:val="superscript"/>
+        </w:rPr>
+        <w:t>(i)</w:t>
+      </w:r>
+      <w:r>
+        <w:rPr>
+          <w:rFonts w:ascii="Cambria Math" w:hAnsi="Cambria Math"/>
+          <w:i/>
+          <w:sz w:val="20"/>
+        </w:rPr>
+        <w:t xml:space="preserve"> = x</w:t>
+      </w:r>
+      <w:r>
+        <w:rPr>
+          <w:rFonts w:ascii="Cambria Math" w:hAnsi="Cambria Math"/>
+          <w:i/>
+          <w:sz w:val="20"/>
+          <w:vertAlign w:val="subscript"/>
+        </w:rPr>
+        <w:t>t-1</w:t>
+      </w:r>
+      <w:r>
+        <w:rPr>
+          <w:rFonts w:ascii="Cambria Math" w:hAnsi="Cambria Math"/>
+          <w:i/>
+          <w:sz w:val="20"/>
+          <w:vertAlign w:val="superscript"/>
+        </w:rPr>
+        <w:t>(i)</w:t>
+      </w:r>
+      <w:r>
+        <w:rPr>
+          <w:rFonts w:ascii="Cambria Math" w:hAnsi="Cambria Math"/>
+          <w:i/>
+          <w:sz w:val="20"/>
+        </w:rPr>
+        <w:t xml:space="preserve"> + v</w:t>
+      </w:r>
+      <w:r>
+        <w:rPr>
+          <w:rFonts w:ascii="Cambria Math" w:hAnsi="Cambria Math"/>
+          <w:i/>
+          <w:sz w:val="20"/>
+          <w:vertAlign w:val="superscript"/>
+        </w:rPr>
+        <w:t>(i)</w:t>
+      </w:r>
+      <w:r>
+        <w:rPr>
+          <w:rFonts w:ascii="Cambria Math" w:hAnsi="Cambria Math"/>
+          <w:i/>
+          <w:sz w:val="20"/>
+        </w:rPr>
+        <w:t xml:space="preserve"> * Δt + N(0, 10</w:t>
+      </w:r>
+      <w:r>
+        <w:rPr>
+          <w:rFonts w:ascii="Cambria Math" w:hAnsi="Cambria Math"/>
+          <w:i/>
+          <w:sz w:val="20"/>
+          <w:vertAlign w:val="superscript"/>
+        </w:rPr>
+        <w:t>-5</w:t>
+      </w:r>
+      <w:r>
+        <w:rPr>
+          <w:rFonts w:ascii="Cambria Math" w:hAnsi="Cambria Math"/>
+          <w:i/>
+          <w:sz w:val="20"/>
+        </w:rPr>
+        <w:t>) \ \ \ (6)</w:t>
       </w:r>
     </w:p>
     <w:p>
@@ -3595,7 +4130,93 @@
           <w:i/>
           <w:sz w:val="20"/>
         </w:rPr>
-        <w:t>w_t^{(i)} = \exp\left(-\frac{1}{2} \cdot \left(\frac{\|x_t^{(i)} - z_t\|}{\sigma}\right)^2\right) \quad (7)</w:t>
+        <w:t>w</w:t>
+      </w:r>
+      <w:r>
+        <w:rPr>
+          <w:rFonts w:ascii="Cambria Math" w:hAnsi="Cambria Math"/>
+          <w:i/>
+          <w:sz w:val="20"/>
+          <w:vertAlign w:val="subscript"/>
+        </w:rPr>
+        <w:t>t</w:t>
+      </w:r>
+      <w:r>
+        <w:rPr>
+          <w:rFonts w:ascii="Cambria Math" w:hAnsi="Cambria Math"/>
+          <w:i/>
+          <w:sz w:val="20"/>
+          <w:vertAlign w:val="superscript"/>
+        </w:rPr>
+        <w:t>(i)</w:t>
+      </w:r>
+      <w:r>
+        <w:rPr>
+          <w:rFonts w:ascii="Cambria Math" w:hAnsi="Cambria Math"/>
+          <w:i/>
+          <w:sz w:val="20"/>
+        </w:rPr>
+        <w:t xml:space="preserve"> = exp(-0.5 * (||x</w:t>
+      </w:r>
+      <w:r>
+        <w:rPr>
+          <w:rFonts w:ascii="Cambria Math" w:hAnsi="Cambria Math"/>
+          <w:i/>
+          <w:sz w:val="20"/>
+          <w:vertAlign w:val="subscript"/>
+        </w:rPr>
+        <w:t>t</w:t>
+      </w:r>
+      <w:r>
+        <w:rPr>
+          <w:rFonts w:ascii="Cambria Math" w:hAnsi="Cambria Math"/>
+          <w:i/>
+          <w:sz w:val="20"/>
+          <w:vertAlign w:val="superscript"/>
+        </w:rPr>
+        <w:t>(i)</w:t>
+      </w:r>
+      <w:r>
+        <w:rPr>
+          <w:rFonts w:ascii="Cambria Math" w:hAnsi="Cambria Math"/>
+          <w:i/>
+          <w:sz w:val="20"/>
+        </w:rPr>
+        <w:t xml:space="preserve"> - z</w:t>
+      </w:r>
+      <w:r>
+        <w:rPr>
+          <w:rFonts w:ascii="Cambria Math" w:hAnsi="Cambria Math"/>
+          <w:i/>
+          <w:sz w:val="20"/>
+          <w:vertAlign w:val="subscript"/>
+        </w:rPr>
+        <w:t>t</w:t>
+      </w:r>
+      <w:r>
+        <w:rPr>
+          <w:rFonts w:ascii="Cambria Math" w:hAnsi="Cambria Math"/>
+          <w:i/>
+          <w:sz w:val="20"/>
+        </w:rPr>
+        <w:t>|| / σ)</w:t>
+      </w:r>
+      <w:r>
+        <w:rPr>
+          <w:rFonts w:ascii="Cambria Math" w:hAnsi="Cambria Math"/>
+          <w:i/>
+          <w:sz w:val="20"/>
+          <w:vertAlign w:val="superscript"/>
+        </w:rPr>
+        <w:t>2</w:t>
+      </w:r>
+      <w:r>
+        <w:rPr>
+          <w:rFonts w:ascii="Cambria Math" w:hAnsi="Cambria Math"/>
+          <w:i/>
+          <w:sz w:val="20"/>
+        </w:rPr>
+        <w:t>) \ \ \ (7)</w:t>
       </w:r>
     </w:p>
     <w:p>
@@ -3617,7 +4238,7 @@
           <w:i/>
           <w:sz w:val="20"/>
         </w:rPr>
-        <w:t>\sigma = \text{accuracy} / 111320</w:t>
+        <w:t>σ = accuracy / 111320</w:t>
       </w:r>
       <w:r>
         <w:rPr>
@@ -3675,7 +4296,93 @@
           <w:i/>
           <w:sz w:val="20"/>
         </w:rPr>
-        <w:t>N_{eff} = \frac{1}{\sum_{i=1}^{N} (w_t^{(i)})^2} \quad (8)</w:t>
+        <w:t>N</w:t>
+      </w:r>
+      <w:r>
+        <w:rPr>
+          <w:rFonts w:ascii="Cambria Math" w:hAnsi="Cambria Math"/>
+          <w:i/>
+          <w:sz w:val="20"/>
+          <w:vertAlign w:val="subscript"/>
+        </w:rPr>
+        <w:t>eff</w:t>
+      </w:r>
+      <w:r>
+        <w:rPr>
+          <w:rFonts w:ascii="Cambria Math" w:hAnsi="Cambria Math"/>
+          <w:i/>
+          <w:sz w:val="20"/>
+        </w:rPr>
+        <w:t xml:space="preserve"> = 1 / Σ</w:t>
+      </w:r>
+      <w:r>
+        <w:rPr>
+          <w:rFonts w:ascii="Cambria Math" w:hAnsi="Cambria Math"/>
+          <w:i/>
+          <w:sz w:val="20"/>
+          <w:vertAlign w:val="subscript"/>
+        </w:rPr>
+        <w:t>i=1</w:t>
+      </w:r>
+      <w:r>
+        <w:rPr>
+          <w:rFonts w:ascii="Cambria Math" w:hAnsi="Cambria Math"/>
+          <w:i/>
+          <w:sz w:val="20"/>
+          <w:vertAlign w:val="superscript"/>
+        </w:rPr>
+        <w:t>N</w:t>
+      </w:r>
+      <w:r>
+        <w:rPr>
+          <w:rFonts w:ascii="Cambria Math" w:hAnsi="Cambria Math"/>
+          <w:i/>
+          <w:sz w:val="20"/>
+        </w:rPr>
+        <w:t xml:space="preserve"> (w</w:t>
+      </w:r>
+      <w:r>
+        <w:rPr>
+          <w:rFonts w:ascii="Cambria Math" w:hAnsi="Cambria Math"/>
+          <w:i/>
+          <w:sz w:val="20"/>
+          <w:vertAlign w:val="subscript"/>
+        </w:rPr>
+        <w:t>t</w:t>
+      </w:r>
+      <w:r>
+        <w:rPr>
+          <w:rFonts w:ascii="Cambria Math" w:hAnsi="Cambria Math"/>
+          <w:i/>
+          <w:sz w:val="20"/>
+          <w:vertAlign w:val="superscript"/>
+        </w:rPr>
+        <w:t>(i)</w:t>
+      </w:r>
+      <w:r>
+        <w:rPr>
+          <w:rFonts w:ascii="Cambria Math" w:hAnsi="Cambria Math"/>
+          <w:i/>
+          <w:sz w:val="20"/>
+        </w:rPr>
+        <w:t>)</w:t>
+      </w:r>
+      <w:r>
+        <w:rPr>
+          <w:rFonts w:ascii="Cambria Math" w:hAnsi="Cambria Math"/>
+          <w:i/>
+          <w:sz w:val="20"/>
+          <w:vertAlign w:val="superscript"/>
+        </w:rPr>
+        <w:t>2</w:t>
+      </w:r>
+      <w:r>
+        <w:rPr>
+          <w:rFonts w:ascii="Cambria Math" w:hAnsi="Cambria Math"/>
+          <w:i/>
+          <w:sz w:val="20"/>
+        </w:rPr>
+        <w:t xml:space="preserve"> \ \ \ (8)</w:t>
       </w:r>
     </w:p>
     <w:p>
@@ -3728,7 +4435,7 @@
           <w:i/>
           <w:sz w:val="20"/>
         </w:rPr>
-        <w:t>\theta</w:t>
+        <w:t>θ</w:t>
       </w:r>
       <w:r>
         <w:rPr>
@@ -3749,7 +4456,7 @@
           <w:i/>
           <w:sz w:val="20"/>
         </w:rPr>
-        <w:t>\Delta\text{lat} = \frac{v \cdot \Delta t \cdot \sin(\theta)}{111320} \quad (9)</w:t>
+        <w:t>Δlat = (v * Δt * sin(θ)) / 111320 \ \ \ (9)</w:t>
       </w:r>
     </w:p>
     <w:p>
@@ -3763,7 +4470,7 @@
           <w:i/>
           <w:sz w:val="20"/>
         </w:rPr>
-        <w:t>\Delta\text{lng} = \frac{v \cdot \Delta t \cdot \cos(\theta)}{111320 \cdot \cos(\text{lat})} \quad (10)</w:t>
+        <w:t>Δlng = (v * Δt * cos(θ)) / (111320 * cos(lat)) \ \ \ (10)</w:t>
       </w:r>
     </w:p>
     <w:p>
@@ -3828,7 +4535,7 @@
           <w:i/>
           <w:sz w:val="20"/>
         </w:rPr>
-        <w:t>a = 6378137\text{ m}, \quad b = 6356752.314245\text{ m}, \quad f = \frac{1}{298.257223563}</w:t>
+        <w:t>a = 6378137 m, \ \ \ b = 6356752.314245 m, \ \ \ f = 1 / 298.257223563</w:t>
       </w:r>
     </w:p>
     <w:p>
@@ -3842,7 +4549,7 @@
           <w:rFonts w:ascii="Times New Roman" w:hAnsi="Times New Roman"/>
           <w:sz w:val="20"/>
         </w:rPr>
-        <w:t xml:space="preserve">The iterative algorithm solves for the geodesic distance through reduced latitude transformations and convergence on the longitude difference </w:t>
+        <w:t xml:space="preserve">The step-by-step formula solves for the geodesic distance through reduced latitude transformations and convergence on the longitude difference </w:t>
       </w:r>
       <w:r>
         <w:rPr>
@@ -3850,7 +4557,7 @@
           <w:i/>
           <w:sz w:val="20"/>
         </w:rPr>
-        <w:t>\lambda</w:t>
+        <w:t>λ</w:t>
       </w:r>
       <w:r>
         <w:rPr>
@@ -3871,7 +4578,92 @@
           <w:i/>
           <w:sz w:val="20"/>
         </w:rPr>
-        <w:t>a_{hav} = \sin^2\left(\frac{\Delta\text{lat}}{2}\right) + \cos(\text{lat}_1)\cos(\text{lat}_2)\sin^2\left(\frac{\Delta\text{lng}}{2}\right) \quad (11)</w:t>
+        <w:t>a</w:t>
+      </w:r>
+      <w:r>
+        <w:rPr>
+          <w:rFonts w:ascii="Cambria Math" w:hAnsi="Cambria Math"/>
+          <w:i/>
+          <w:sz w:val="20"/>
+          <w:vertAlign w:val="subscript"/>
+        </w:rPr>
+        <w:t>hav</w:t>
+      </w:r>
+      <w:r>
+        <w:rPr>
+          <w:rFonts w:ascii="Cambria Math" w:hAnsi="Cambria Math"/>
+          <w:i/>
+          <w:sz w:val="20"/>
+        </w:rPr>
+        <w:t xml:space="preserve"> = sin</w:t>
+      </w:r>
+      <w:r>
+        <w:rPr>
+          <w:rFonts w:ascii="Cambria Math" w:hAnsi="Cambria Math"/>
+          <w:i/>
+          <w:sz w:val="20"/>
+          <w:vertAlign w:val="superscript"/>
+        </w:rPr>
+        <w:t>2</w:t>
+      </w:r>
+      <w:r>
+        <w:rPr>
+          <w:rFonts w:ascii="Cambria Math" w:hAnsi="Cambria Math"/>
+          <w:i/>
+          <w:sz w:val="20"/>
+        </w:rPr>
+        <w:t>(Δlat/2) + cos(lat</w:t>
+      </w:r>
+      <w:r>
+        <w:rPr>
+          <w:rFonts w:ascii="Cambria Math" w:hAnsi="Cambria Math"/>
+          <w:i/>
+          <w:sz w:val="20"/>
+          <w:vertAlign w:val="subscript"/>
+        </w:rPr>
+        <w:t>1</w:t>
+      </w:r>
+      <w:r>
+        <w:rPr>
+          <w:rFonts w:ascii="Cambria Math" w:hAnsi="Cambria Math"/>
+          <w:i/>
+          <w:sz w:val="20"/>
+        </w:rPr>
+        <w:t>) * cos(lat</w:t>
+      </w:r>
+      <w:r>
+        <w:rPr>
+          <w:rFonts w:ascii="Cambria Math" w:hAnsi="Cambria Math"/>
+          <w:i/>
+          <w:sz w:val="20"/>
+          <w:vertAlign w:val="subscript"/>
+        </w:rPr>
+        <w:t>2</w:t>
+      </w:r>
+      <w:r>
+        <w:rPr>
+          <w:rFonts w:ascii="Cambria Math" w:hAnsi="Cambria Math"/>
+          <w:i/>
+          <w:sz w:val="20"/>
+        </w:rPr>
+        <w:t>) * sin</w:t>
+      </w:r>
+      <w:r>
+        <w:rPr>
+          <w:rFonts w:ascii="Cambria Math" w:hAnsi="Cambria Math"/>
+          <w:i/>
+          <w:sz w:val="20"/>
+          <w:vertAlign w:val="superscript"/>
+        </w:rPr>
+        <w:t>2</w:t>
+      </w:r>
+      <w:r>
+        <w:rPr>
+          <w:rFonts w:ascii="Cambria Math" w:hAnsi="Cambria Math"/>
+          <w:i/>
+          <w:sz w:val="20"/>
+        </w:rPr>
+        <w:t>(Δlng/2) \ \ \ (11)</w:t>
       </w:r>
     </w:p>
     <w:p>
@@ -3885,7 +4677,41 @@
           <w:i/>
           <w:sz w:val="20"/>
         </w:rPr>
-        <w:t>d = 2 R_e \arcsin\left(\sqrt{a_{hav}}\right) \quad (12)</w:t>
+        <w:t>d = 2 R</w:t>
+      </w:r>
+      <w:r>
+        <w:rPr>
+          <w:rFonts w:ascii="Cambria Math" w:hAnsi="Cambria Math"/>
+          <w:i/>
+          <w:sz w:val="20"/>
+          <w:vertAlign w:val="subscript"/>
+        </w:rPr>
+        <w:t>e</w:t>
+      </w:r>
+      <w:r>
+        <w:rPr>
+          <w:rFonts w:ascii="Cambria Math" w:hAnsi="Cambria Math"/>
+          <w:i/>
+          <w:sz w:val="20"/>
+        </w:rPr>
+        <w:t xml:space="preserve"> * arcsin(√(a</w:t>
+      </w:r>
+      <w:r>
+        <w:rPr>
+          <w:rFonts w:ascii="Cambria Math" w:hAnsi="Cambria Math"/>
+          <w:i/>
+          <w:sz w:val="20"/>
+          <w:vertAlign w:val="subscript"/>
+        </w:rPr>
+        <w:t>hav</w:t>
+      </w:r>
+      <w:r>
+        <w:rPr>
+          <w:rFonts w:ascii="Cambria Math" w:hAnsi="Cambria Math"/>
+          <w:i/>
+          <w:sz w:val="20"/>
+        </w:rPr>
+        <w:t>)) \ \ \ (12)</w:t>
       </w:r>
     </w:p>
     <w:p>
@@ -3929,7 +4755,92 @@
           <w:i/>
           <w:sz w:val="20"/>
         </w:rPr>
-        <w:t>\theta = \text{atan2}\left(\sin(\Delta\text{lng})\cos(\text{lat}_2),\ \cos(\text{lat}_1)\sin(\text{lat}_2) - \sin(\text{lat}_1)\cos(\text{lat}_2)\cos(\Delta\text{lng})\right) \quad (13)</w:t>
+        <w:t>θ = atan2(sin(Δlng) * cos(lat</w:t>
+      </w:r>
+      <w:r>
+        <w:rPr>
+          <w:rFonts w:ascii="Cambria Math" w:hAnsi="Cambria Math"/>
+          <w:i/>
+          <w:sz w:val="20"/>
+          <w:vertAlign w:val="subscript"/>
+        </w:rPr>
+        <w:t>2</w:t>
+      </w:r>
+      <w:r>
+        <w:rPr>
+          <w:rFonts w:ascii="Cambria Math" w:hAnsi="Cambria Math"/>
+          <w:i/>
+          <w:sz w:val="20"/>
+        </w:rPr>
+        <w:t>), cos(lat</w:t>
+      </w:r>
+      <w:r>
+        <w:rPr>
+          <w:rFonts w:ascii="Cambria Math" w:hAnsi="Cambria Math"/>
+          <w:i/>
+          <w:sz w:val="20"/>
+          <w:vertAlign w:val="subscript"/>
+        </w:rPr>
+        <w:t>1</w:t>
+      </w:r>
+      <w:r>
+        <w:rPr>
+          <w:rFonts w:ascii="Cambria Math" w:hAnsi="Cambria Math"/>
+          <w:i/>
+          <w:sz w:val="20"/>
+        </w:rPr>
+        <w:t>) * sin(lat</w:t>
+      </w:r>
+      <w:r>
+        <w:rPr>
+          <w:rFonts w:ascii="Cambria Math" w:hAnsi="Cambria Math"/>
+          <w:i/>
+          <w:sz w:val="20"/>
+          <w:vertAlign w:val="subscript"/>
+        </w:rPr>
+        <w:t>2</w:t>
+      </w:r>
+      <w:r>
+        <w:rPr>
+          <w:rFonts w:ascii="Cambria Math" w:hAnsi="Cambria Math"/>
+          <w:i/>
+          <w:sz w:val="20"/>
+        </w:rPr>
+        <w:t>) - sin(lat</w:t>
+      </w:r>
+      <w:r>
+        <w:rPr>
+          <w:rFonts w:ascii="Cambria Math" w:hAnsi="Cambria Math"/>
+          <w:i/>
+          <w:sz w:val="20"/>
+          <w:vertAlign w:val="subscript"/>
+        </w:rPr>
+        <w:t>1</w:t>
+      </w:r>
+      <w:r>
+        <w:rPr>
+          <w:rFonts w:ascii="Cambria Math" w:hAnsi="Cambria Math"/>
+          <w:i/>
+          <w:sz w:val="20"/>
+        </w:rPr>
+        <w:t>) * cos(lat</w:t>
+      </w:r>
+      <w:r>
+        <w:rPr>
+          <w:rFonts w:ascii="Cambria Math" w:hAnsi="Cambria Math"/>
+          <w:i/>
+          <w:sz w:val="20"/>
+          <w:vertAlign w:val="subscript"/>
+        </w:rPr>
+        <w:t>2</w:t>
+      </w:r>
+      <w:r>
+        <w:rPr>
+          <w:rFonts w:ascii="Cambria Math" w:hAnsi="Cambria Math"/>
+          <w:i/>
+          <w:sz w:val="20"/>
+        </w:rPr>
+        <w:t>) * cos(Δlng)) \ \ \ (13)</w:t>
       </w:r>
     </w:p>
     <w:p>
@@ -3957,7 +4868,41 @@
           <w:i/>
           <w:sz w:val="20"/>
         </w:rPr>
-        <w:t>\theta_{rel} = (\theta - \psi_{EV} + 360°) \mod 360° \quad (14)</w:t>
+        <w:t>θ</w:t>
+      </w:r>
+      <w:r>
+        <w:rPr>
+          <w:rFonts w:ascii="Cambria Math" w:hAnsi="Cambria Math"/>
+          <w:i/>
+          <w:sz w:val="20"/>
+          <w:vertAlign w:val="subscript"/>
+        </w:rPr>
+        <w:t>rel</w:t>
+      </w:r>
+      <w:r>
+        <w:rPr>
+          <w:rFonts w:ascii="Cambria Math" w:hAnsi="Cambria Math"/>
+          <w:i/>
+          <w:sz w:val="20"/>
+        </w:rPr>
+        <w:t xml:space="preserve"> = (θ - ψ</w:t>
+      </w:r>
+      <w:r>
+        <w:rPr>
+          <w:rFonts w:ascii="Cambria Math" w:hAnsi="Cambria Math"/>
+          <w:i/>
+          <w:sz w:val="20"/>
+          <w:vertAlign w:val="subscript"/>
+        </w:rPr>
+        <w:t>EV</w:t>
+      </w:r>
+      <w:r>
+        <w:rPr>
+          <w:rFonts w:ascii="Cambria Math" w:hAnsi="Cambria Math"/>
+          <w:i/>
+          <w:sz w:val="20"/>
+        </w:rPr>
+        <w:t xml:space="preserve"> + 360°) mod 360° \ \ \ (14)</w:t>
       </w:r>
     </w:p>
     <w:p>
@@ -3985,7 +4930,24 @@
           <w:i/>
           <w:sz w:val="20"/>
         </w:rPr>
-        <w:t>\theta_{rel} &lt; 180°</w:t>
+        <w:t>θ</w:t>
+      </w:r>
+      <w:r>
+        <w:rPr>
+          <w:rFonts w:ascii="Cambria Math" w:hAnsi="Cambria Math"/>
+          <w:i/>
+          <w:sz w:val="20"/>
+          <w:vertAlign w:val="subscript"/>
+        </w:rPr>
+        <w:t>rel</w:t>
+      </w:r>
+      <w:r>
+        <w:rPr>
+          <w:rFonts w:ascii="Cambria Math" w:hAnsi="Cambria Math"/>
+          <w:i/>
+          <w:sz w:val="20"/>
+        </w:rPr>
+        <w:t xml:space="preserve"> &lt; 180°</w:t>
       </w:r>
       <w:r>
         <w:rPr>
@@ -4050,7 +5012,24 @@
           <w:i/>
           <w:sz w:val="20"/>
         </w:rPr>
-        <w:t>\theta_{rel} \geq 180°</w:t>
+        <w:t>θ</w:t>
+      </w:r>
+      <w:r>
+        <w:rPr>
+          <w:rFonts w:ascii="Cambria Math" w:hAnsi="Cambria Math"/>
+          <w:i/>
+          <w:sz w:val="20"/>
+          <w:vertAlign w:val="subscript"/>
+        </w:rPr>
+        <w:t>rel</w:t>
+      </w:r>
+      <w:r>
+        <w:rPr>
+          <w:rFonts w:ascii="Cambria Math" w:hAnsi="Cambria Math"/>
+          <w:i/>
+          <w:sz w:val="20"/>
+        </w:rPr>
+        <w:t xml:space="preserve"> \geq 180°</w:t>
       </w:r>
       <w:r>
         <w:rPr>
@@ -4117,7 +5096,7 @@
           <w:rFonts w:ascii="Times New Roman" w:hAnsi="Times New Roman"/>
           <w:sz w:val="20"/>
         </w:rPr>
-        <w:t>When a civilian vehicle detects an active EV within the configurable V2V range (default: 25 m), the system triggers a multi-modal alert:</w:t>
+        <w:t>When a civilian vehicle detects an active EV within the configurable V2V desirable distance range, the system triggers a multi-modal alert:</w:t>
       </w:r>
     </w:p>
     <w:p>
@@ -4263,7 +5242,7 @@
           <w:rFonts w:ascii="Times New Roman" w:hAnsi="Times New Roman"/>
           <w:sz w:val="20"/>
         </w:rPr>
-        <w:t>Traffic signals monitor the EV's real-time distance. When the EV enters the V2I preemption range (default: 50 m):</w:t>
+        <w:t>Traffic signals monitor the EV's real-time distance. When the EV enters the V2I preemption desirable distance range:</w:t>
       </w:r>
     </w:p>
     <w:p>
@@ -4459,7 +5438,7 @@
           <w:rFonts w:ascii="Times New Roman" w:hAnsi="Times New Roman"/>
           <w:sz w:val="20"/>
         </w:rPr>
-        <w:t>Modern passenger vehicles feature central infotainment screens that can be leveraged for V2X alert delivery.</w:t>
+        <w:t>Modern passenger vehicles feature central infotainment screens that can be used for V2X alert delivery.</w:t>
       </w:r>
     </w:p>
     <w:p>
@@ -4488,7 +5467,7 @@
           <w:rFonts w:ascii="Times New Roman" w:hAnsi="Times New Roman"/>
           <w:sz w:val="20"/>
         </w:rPr>
-        <w:t>The web-based Syntrix V2X client can be packaged into a native application container using Apache Cordova or Capacitor. By implementing the Android for Cars App Library (Car App API Level 6+) and Apple CarPlay App Templates (CPAlertTemplate, CPPointOfInterestTemplate), the V2X alert interface is mirrored onto the vehicle's center console screen. During an active alert, the system uses the navigation template UI to overlay high-contrast yield instructions (directional arrows and text) over the active navigation display.</w:t>
+        <w:t>The web-based V2X client can be packaged into a native application container using Apache Cordova or Capacitor. By implementing the Android for Cars App Library (Car App API Level 6+) and Apple CarPlay App Templates (CPAlertTemplate, CPPointOfInterestTemplate), the V2X alert interface is mirrored onto the vehicle's center console screen. During an active alert, the system uses the navigation template UI to overlay high-contrast yield instructions (directional arrows and text) over the active navigation display.</w:t>
       </w:r>
     </w:p>
     <w:p>
@@ -4830,7 +5809,7 @@
           <w:rFonts w:ascii="Times New Roman" w:hAnsi="Times New Roman"/>
           <w:sz w:val="20"/>
         </w:rPr>
-        <w:t>A significant challenge in developing countries is the high volume of older passenger cars, commercial trucks, auto-rickshaws, and two-wheelers that lack digital infotainment screens. We propose four alternative interaction paradigms:</w:t>
+        <w:t>A big problem in developing countries is the high volume of older passenger cars, commercial trucks, auto-rickshaws, and two-wheelers that lack digital infotainment screens. We propose four alternative interaction paradigms:</w:t>
       </w:r>
     </w:p>
     <w:p>
@@ -5125,7 +6104,7 @@
           <w:rFonts w:ascii="Times New Roman" w:hAnsi="Times New Roman"/>
           <w:sz w:val="20"/>
         </w:rPr>
-        <w:t>Motorcycle riders face high ambient wind noise (&gt; 80 dB at 60 km/h), rendering acoustic alerts ineffective. The V2X application connects via Bluetooth Low Energy to haptic actuators installed in:</w:t>
+        <w:t>Motorcycle riders face high ambient wind noise (&gt; 80 dB at 60 km/h), making sound alerts useless. The V2X application connects via Bluetooth Low Energy to haptic actuators installed in:</w:t>
       </w:r>
     </w:p>
     <w:p>
@@ -5369,7 +6348,7 @@
                 <w:rFonts w:ascii="Times New Roman" w:hAnsi="Times New Roman"/>
                 <w:sz w:val="16"/>
               </w:rPr>
-              <w:t>25–15 m</w:t>
+              <w:t>Outer desirable distance</w:t>
             </w:r>
           </w:p>
         </w:tc>
@@ -5456,7 +6435,7 @@
                 <w:rFonts w:ascii="Times New Roman" w:hAnsi="Times New Roman"/>
                 <w:sz w:val="16"/>
               </w:rPr>
-              <w:t>15–8 m</w:t>
+              <w:t>Mid desirable distance</w:t>
             </w:r>
           </w:p>
         </w:tc>
@@ -5543,7 +6522,7 @@
                 <w:rFonts w:ascii="Times New Roman" w:hAnsi="Times New Roman"/>
                 <w:sz w:val="16"/>
               </w:rPr>
-              <w:t>&lt; 8 m</w:t>
+              <w:t>Inner desirable distance</w:t>
             </w:r>
           </w:p>
         </w:tc>
@@ -7947,7 +8926,7 @@
           <w:rFonts w:ascii="Times New Roman" w:hAnsi="Times New Roman"/>
           <w:sz w:val="20"/>
         </w:rPr>
-        <w:t xml:space="preserve">The average latency from when the EV entered the preemption range (50 m) to when the traffic signal transitioned to green was </w:t>
+        <w:t xml:space="preserve">The average latency from when the EV entered the preemption desirable distance range to when the traffic signal transitioned to green was </w:t>
       </w:r>
       <w:r>
         <w:rPr>
@@ -7962,7 +8941,7 @@
           <w:rFonts w:ascii="Times New Roman" w:hAnsi="Times New Roman"/>
           <w:sz w:val="20"/>
         </w:rPr>
-        <w:t xml:space="preserve"> (including one signal cycle transition). At typical urban speeds of 40–60 km/h, this response time is sufficient to establish green corridors when the preemption range is configured to 150–200 meters.</w:t>
+        <w:t xml:space="preserve"> (including one signal cycle transition). At typical urban speeds of 40–60 km/h, this response time is sufficient to establish green corridors when the preemption range is configured to an extended desirable distance.</w:t>
       </w:r>
     </w:p>
     <w:p>
@@ -8314,14 +9293,14 @@
           <w:b/>
           <w:sz w:val="20"/>
         </w:rPr>
-        <w:t>Syntrix V2X</w:t>
-      </w:r>
-      <w:r>
-        <w:rPr>
-          <w:rFonts w:ascii="Times New Roman" w:hAnsi="Times New Roman"/>
-          <w:sz w:val="20"/>
-        </w:rPr>
-        <w:t>, a software-defined, zero-hardware-cost Vehicle-to-Everything emergency clearance system. By leveraging browser-based Geolocation APIs, a dual-stage Kalman + Particle filtering pipeline, and Firebase Realtime Database synchronization, the system achieves real-time V2V yield alerts (sub-500 ms latency) and V2I traffic signal preemption (1.4 s average transition time) without requiring any dedicated radio hardware.</w:t>
+        <w:t>V2X</w:t>
+      </w:r>
+      <w:r>
+        <w:rPr>
+          <w:rFonts w:ascii="Times New Roman" w:hAnsi="Times New Roman"/>
+          <w:sz w:val="20"/>
+        </w:rPr>
+        <w:t>, a software-defined, zero-hardware-cost Vehicle-to-Everything emergency clearance system. By using browser-based Geolocation APIs, a dual-stage Kalman + Particle filtering pipeline, and Firebase Realtime Database synchronization, the system achieves real-time V2V yield alerts (sub-500 ms latency) and V2I traffic signal preemption (1.4 s average transition time) without requiring any dedicated radio hardware.</w:t>
       </w:r>
     </w:p>
     <w:p>
@@ -8405,7 +9384,7 @@
           <w:rFonts w:ascii="Times New Roman" w:hAnsi="Times New Roman"/>
           <w:sz w:val="20"/>
         </w:rPr>
-        <w:t>The system has been fully implemented, deployed on Firebase Hosting, and tested in real urban conditions at Silk Board Junction, Bengaluru. The results demonstrate that software-defined V2X architectures can achieve the latencies and positional stability necessary to meaningfully improve emergency vehicle response times in modern urban environments, even in the challenging infrastructure context of developing nations.</w:t>
+        <w:t>The system has been fully implemented, deployed on Firebase Hosting, and tested in real urban conditions at Silk Board Junction, Bengaluru. The results demonstrate that software-defined V2X architectures can achieve the latencies and positional stability necessary to actually improve emergency vehicle response times in modern urban environments, even in the challenging infrastructure context of developing nations.</w:t>
       </w:r>
     </w:p>
     <w:p>
@@ -8503,7 +9482,7 @@
           <w:rFonts w:ascii="Times New Roman" w:hAnsi="Times New Roman"/>
           <w:sz w:val="16"/>
         </w:rPr>
-        <w:t xml:space="preserve">[1] X. Qin and A. M. Khan, "GPS-Based Emergency Vehicle Preemption System," </w:t>
+        <w:t xml:space="preserve">[1] H. Noori, C. Olaverri-Monreal, and S. Selpi, "Connected Vehicle Approach for Emergency Vehicle Preemption," in </w:t>
       </w:r>
       <w:r>
         <w:rPr>
@@ -8511,14 +9490,14 @@
           <w:i/>
           <w:sz w:val="16"/>
         </w:rPr>
-        <w:t>Transportation Research Record</w:t>
+        <w:t>Proc. IEEE Int. Conf. Vehicular Electronics and Safety</w:t>
       </w:r>
       <w:r>
         <w:rPr>
           <w:rFonts w:ascii="Times New Roman" w:hAnsi="Times New Roman"/>
           <w:sz w:val="16"/>
         </w:rPr>
-        <w:t>, vol. 2324, pp. 105–112, 2012.</w:t>
+        <w:t>, 2016, pp. 1–6.</w:t>
       </w:r>
     </w:p>
     <w:p>
@@ -8532,22 +9511,7 @@
           <w:rFonts w:ascii="Times New Roman" w:hAnsi="Times New Roman"/>
           <w:sz w:val="16"/>
         </w:rPr>
-        <w:t xml:space="preserve">[2] H. Noori, C. Olaverri-Monreal, and S. Selpi, "Connected Vehicle Approach for Emergency Vehicle Preemption," in </w:t>
-      </w:r>
-      <w:r>
-        <w:rPr>
-          <w:rFonts w:ascii="Times New Roman" w:hAnsi="Times New Roman"/>
-          <w:i/>
-          <w:sz w:val="16"/>
-        </w:rPr>
-        <w:t>Proc. IEEE Int. Conf. Vehicular Electronics and Safety</w:t>
-      </w:r>
-      <w:r>
-        <w:rPr>
-          <w:rFonts w:ascii="Times New Roman" w:hAnsi="Times New Roman"/>
-          <w:sz w:val="16"/>
-        </w:rPr>
-        <w:t>, 2016, pp. 1–6.</w:t>
+        <w:t>[2] Google LLC, "Firebase Realtime Database Documentation," 2024. [Online]. Available: https://firebase.google.com/docs/database</w:t>
       </w:r>
     </w:p>
     <w:p>
@@ -8561,22 +9525,7 @@
           <w:rFonts w:ascii="Times New Roman" w:hAnsi="Times New Roman"/>
           <w:sz w:val="16"/>
         </w:rPr>
-        <w:t xml:space="preserve">[3] R. Sharma and A. Gupta, "Cloud-Based V2X Communication for Developing Countries," </w:t>
-      </w:r>
-      <w:r>
-        <w:rPr>
-          <w:rFonts w:ascii="Times New Roman" w:hAnsi="Times New Roman"/>
-          <w:i/>
-          <w:sz w:val="16"/>
-        </w:rPr>
-        <w:t>Int. J. Advanced Research in Computer Science</w:t>
-      </w:r>
-      <w:r>
-        <w:rPr>
-          <w:rFonts w:ascii="Times New Roman" w:hAnsi="Times New Roman"/>
-          <w:sz w:val="16"/>
-        </w:rPr>
-        <w:t>, vol. 10, no. 3, pp. 45–52, 2019.</w:t>
+        <w:t>[3] Leaflet Contributors, "Leaflet: An Open-Source JavaScript Library for Interactive Maps," 2024. [Online]. Available: https://leafletjs.com</w:t>
       </w:r>
     </w:p>
     <w:p>
@@ -8590,22 +9539,7 @@
           <w:rFonts w:ascii="Times New Roman" w:hAnsi="Times New Roman"/>
           <w:sz w:val="16"/>
         </w:rPr>
-        <w:t xml:space="preserve">[4] R. E. Kálmán, "A New Approach to Linear Filtering and Prediction Problems," </w:t>
-      </w:r>
-      <w:r>
-        <w:rPr>
-          <w:rFonts w:ascii="Times New Roman" w:hAnsi="Times New Roman"/>
-          <w:i/>
-          <w:sz w:val="16"/>
-        </w:rPr>
-        <w:t>Journal of Basic Engineering</w:t>
-      </w:r>
-      <w:r>
-        <w:rPr>
-          <w:rFonts w:ascii="Times New Roman" w:hAnsi="Times New Roman"/>
-          <w:sz w:val="16"/>
-        </w:rPr>
-        <w:t>, vol. 82, no. 1, pp. 35–45, 1960.</w:t>
+        <w:t>[4] OSRM Project, "Open Source Routing Machine," 2024. [Online]. Available: https://project-osrm.org</w:t>
       </w:r>
     </w:p>
     <w:p>
@@ -8619,7 +9553,7 @@
           <w:rFonts w:ascii="Times New Roman" w:hAnsi="Times New Roman"/>
           <w:sz w:val="16"/>
         </w:rPr>
-        <w:t>[5] Google LLC, "Firebase Realtime Database Documentation," 2024. [Online]. Available: https://firebase.google.com/docs/database</w:t>
+        <w:t>[5] IEEE Standards Association, "IEEE Standard for Wireless Access in Vehicular Environments (WAVE)," IEEE Std 802.11p-2010, 2010.</w:t>
       </w:r>
     </w:p>
     <w:p>
@@ -8633,7 +9567,7 @@
           <w:rFonts w:ascii="Times New Roman" w:hAnsi="Times New Roman"/>
           <w:sz w:val="16"/>
         </w:rPr>
-        <w:t>[6] Leaflet Contributors, "Leaflet: An Open-Source JavaScript Library for Interactive Maps," 2024. [Online]. Available: https://leafletjs.com</w:t>
+        <w:t>[6] 3GPP, "Technical Specification Group Radio Access Network; Evolved Universal Terrestrial Radio Access (E-UTRA); Physical Layer Procedures (Release 14)," 3GPP TS 36.213, v14.7.0, 2018.</w:t>
       </w:r>
     </w:p>
     <w:p>
@@ -8647,7 +9581,7 @@
           <w:rFonts w:ascii="Times New Roman" w:hAnsi="Times New Roman"/>
           <w:sz w:val="16"/>
         </w:rPr>
-        <w:t>[7] OSRM Project, "Open Source Routing Machine," 2024. [Online]. Available: https://project-osrm.org</w:t>
+        <w:t>[7] National Crime Records Bureau, "Accidental Deaths &amp; Suicides in India (ADSI) — 2022," Ministry of Home Affairs, Govt. of India, 2023.</w:t>
       </w:r>
     </w:p>
     <w:p>
@@ -8661,7 +9595,7 @@
           <w:rFonts w:ascii="Times New Roman" w:hAnsi="Times New Roman"/>
           <w:sz w:val="16"/>
         </w:rPr>
-        <w:t>[8] IEEE Standards Association, "IEEE Standard for Wireless Access in Vehicular Environments (WAVE)," IEEE Std 802.11p-2010, 2010.</w:t>
+        <w:t>[8] 3GPP, "NR Sidelink Relay; Stage 2 (Release 17)," 3GPP TS 23.304, v17.4.0, 2023.</w:t>
       </w:r>
     </w:p>
     <w:p>
@@ -8675,7 +9609,7 @@
           <w:rFonts w:ascii="Times New Roman" w:hAnsi="Times New Roman"/>
           <w:sz w:val="16"/>
         </w:rPr>
-        <w:t>[9] 3GPP, "Technical Specification Group Radio Access Network; Evolved Universal Terrestrial Radio Access (E-UTRA); Physical Layer Procedures (Release 14)," 3GPP TS 36.213, v14.7.0, 2018.</w:t>
+        <w:t>[9] 5GAA, "C-V2X Use Cases and Service Level Requirements: Volume II," White Paper, 5G Automotive Association, 2020.</w:t>
       </w:r>
     </w:p>
     <w:p>
@@ -8689,7 +9623,22 @@
           <w:rFonts w:ascii="Times New Roman" w:hAnsi="Times New Roman"/>
           <w:sz w:val="16"/>
         </w:rPr>
-        <w:t>[10] National Crime Records Bureau, "Accidental Deaths &amp; Suicides in India (ADSI) — 2022," Ministry of Home Affairs, Govt. of India, 2023.</w:t>
+        <w:t xml:space="preserve">[10] M. Gonzalez-Martin, M. Sepulcre, R. Molina-Masegosa, and J. Gozalvez, "Analytical Models of the Performance of C-V2X Mode 4 Vehicular Communications," </w:t>
+      </w:r>
+      <w:r>
+        <w:rPr>
+          <w:rFonts w:ascii="Times New Roman" w:hAnsi="Times New Roman"/>
+          <w:i/>
+          <w:sz w:val="16"/>
+        </w:rPr>
+        <w:t>IEEE Trans. Vehicular Technology</w:t>
+      </w:r>
+      <w:r>
+        <w:rPr>
+          <w:rFonts w:ascii="Times New Roman" w:hAnsi="Times New Roman"/>
+          <w:sz w:val="16"/>
+        </w:rPr>
+        <w:t>, vol. 68, no. 2, pp. 1155–1166, Feb. 2019.</w:t>
       </w:r>
     </w:p>
     <w:p>
@@ -8703,22 +9652,7 @@
           <w:rFonts w:ascii="Times New Roman" w:hAnsi="Times New Roman"/>
           <w:sz w:val="16"/>
         </w:rPr>
-        <w:t xml:space="preserve">[11] K. Sehla, T. M. T. Nguyen, G. Pujolle, and P. B. Velloso, "Resource Allocation Modes in C-V2X: From LTE-V2X to 5G-V2X," </w:t>
-      </w:r>
-      <w:r>
-        <w:rPr>
-          <w:rFonts w:ascii="Times New Roman" w:hAnsi="Times New Roman"/>
-          <w:i/>
-          <w:sz w:val="16"/>
-        </w:rPr>
-        <w:t>IEEE Internet of Things Journal</w:t>
-      </w:r>
-      <w:r>
-        <w:rPr>
-          <w:rFonts w:ascii="Times New Roman" w:hAnsi="Times New Roman"/>
-          <w:sz w:val="16"/>
-        </w:rPr>
-        <w:t>, vol. 9, no. 11, pp. 8291–8314, June 2022.</w:t>
+        <w:t>[11] W3C, "Geolocation API Specification," W3C Recommendation, 2022. [Online]. Available: https://www.w3.org/TR/geolocation/</w:t>
       </w:r>
     </w:p>
     <w:p>
@@ -8732,7 +9666,7 @@
           <w:rFonts w:ascii="Times New Roman" w:hAnsi="Times New Roman"/>
           <w:sz w:val="16"/>
         </w:rPr>
-        <w:t>[12] 3GPP, "NR Sidelink Relay; Stage 2 (Release 17)," 3GPP TS 23.304, v17.4.0, 2023.</w:t>
+        <w:t>[12] Android Developers, "Build Apps for Android Auto," 2024. [Online]. Available: https://developer.android.com/training/cars</w:t>
       </w:r>
     </w:p>
     <w:p>
@@ -8746,7 +9680,7 @@
           <w:rFonts w:ascii="Times New Roman" w:hAnsi="Times New Roman"/>
           <w:sz w:val="16"/>
         </w:rPr>
-        <w:t>[13] 5GAA, "C-V2X Use Cases and Service Level Requirements: Volume II," White Paper, 5G Automotive Association, 2020.</w:t>
+        <w:t>[13] Apple Inc., "CarPlay App Programming Guide," 2024. [Online]. Available: https://developer.apple.com/carplay/</w:t>
       </w:r>
     </w:p>
     <w:p>
@@ -8760,144 +9694,13 @@
           <w:rFonts w:ascii="Times New Roman" w:hAnsi="Times New Roman"/>
           <w:sz w:val="16"/>
         </w:rPr>
-        <w:t xml:space="preserve">[14] M. Gonzalez-Martin, M. Sepulcre, R. Molina-Masegosa, and J. Gozalvez, "Analytical Models of the Performance of C-V2X Mode 4 Vehicular Communications," </w:t>
-      </w:r>
-      <w:r>
-        <w:rPr>
-          <w:rFonts w:ascii="Times New Roman" w:hAnsi="Times New Roman"/>
-          <w:i/>
-          <w:sz w:val="16"/>
-        </w:rPr>
-        <w:t>IEEE Trans. Vehicular Technology</w:t>
-      </w:r>
-      <w:r>
-        <w:rPr>
-          <w:rFonts w:ascii="Times New Roman" w:hAnsi="Times New Roman"/>
-          <w:sz w:val="16"/>
-        </w:rPr>
-        <w:t>, vol. 68, no. 2, pp. 1155–1166, Feb. 2019.</w:t>
+        <w:t>[14] SAE International, "Taxonomy and Definitions for Terms Related to Cooperative Driving Automation for On-Road Motor Vehicles," SAE J3216, 2022.</w:t>
       </w:r>
     </w:p>
     <w:p>
       <w:pPr>
-        <w:spacing w:after="40" w:line="240" w:lineRule="auto"/>
-        <w:ind w:left="288" w:hanging="288"/>
-        <w:jc w:val="both"/>
-      </w:pPr>
-      <w:r>
-        <w:rPr>
-          <w:rFonts w:ascii="Times New Roman" w:hAnsi="Times New Roman"/>
-          <w:sz w:val="16"/>
-        </w:rPr>
-        <w:t>[15] W3C, "Geolocation API Specification," W3C Recommendation, 2022. [Online]. Available: https://www.w3.org/TR/geolocation/</w:t>
-      </w:r>
-    </w:p>
-    <w:p>
-      <w:pPr>
-        <w:spacing w:after="40" w:line="240" w:lineRule="auto"/>
-        <w:ind w:left="288" w:hanging="288"/>
-        <w:jc w:val="both"/>
-      </w:pPr>
-      <w:r>
-        <w:rPr>
-          <w:rFonts w:ascii="Times New Roman" w:hAnsi="Times New Roman"/>
-          <w:sz w:val="16"/>
-        </w:rPr>
-        <w:t>[16] Android Developers, "Build Apps for Android Auto," 2024. [Online]. Available: https://developer.android.com/training/cars</w:t>
-      </w:r>
-    </w:p>
-    <w:p>
-      <w:pPr>
-        <w:spacing w:after="40" w:line="240" w:lineRule="auto"/>
-        <w:ind w:left="288" w:hanging="288"/>
-        <w:jc w:val="both"/>
-      </w:pPr>
-      <w:r>
-        <w:rPr>
-          <w:rFonts w:ascii="Times New Roman" w:hAnsi="Times New Roman"/>
-          <w:sz w:val="16"/>
-        </w:rPr>
-        <w:t>[17] Apple Inc., "CarPlay App Programming Guide," 2024. [Online]. Available: https://developer.apple.com/carplay/</w:t>
-      </w:r>
-    </w:p>
-    <w:p>
-      <w:pPr>
-        <w:spacing w:after="40" w:line="240" w:lineRule="auto"/>
-        <w:ind w:left="288" w:hanging="288"/>
-        <w:jc w:val="both"/>
-      </w:pPr>
-      <w:r>
-        <w:rPr>
-          <w:rFonts w:ascii="Times New Roman" w:hAnsi="Times New Roman"/>
-          <w:sz w:val="16"/>
-        </w:rPr>
-        <w:t>[18] SAE International, "Taxonomy and Definitions for Terms Related to Cooperative Driving Automation for On-Road Motor Vehicles," SAE J3216, 2022.</w:t>
-      </w:r>
-    </w:p>
-    <w:p>
-      <w:pPr>
         <w:spacing w:after="120"/>
       </w:pPr>
-    </w:p>
-    <w:p>
-      <w:pPr>
-        <w:keepNext/>
-        <w:spacing w:before="240" w:after="80"/>
-        <w:jc w:val="center"/>
-      </w:pPr>
-      <w:r>
-        <w:rPr>
-          <w:rFonts w:ascii="Times New Roman" w:hAnsi="Times New Roman"/>
-          <w:b/>
-          <w:color w:val="000000"/>
-          <w:sz w:val="20"/>
-        </w:rPr>
-        <w:t>AUTHOR BIOGRAPHIES</w:t>
-      </w:r>
-    </w:p>
-    <w:p>
-      <w:pPr>
-        <w:spacing w:after="80" w:line="240" w:lineRule="auto"/>
-        <w:ind w:firstLine="216"/>
-        <w:jc w:val="both"/>
-      </w:pPr>
-      <w:r>
-        <w:rPr>
-          <w:rFonts w:ascii="Times New Roman" w:hAnsi="Times New Roman"/>
-          <w:b/>
-          <w:sz w:val="20"/>
-        </w:rPr>
-        <w:t>Ayush K. Bhat</w:t>
-      </w:r>
-      <w:r>
-        <w:rPr>
-          <w:rFonts w:ascii="Times New Roman" w:hAnsi="Times New Roman"/>
-          <w:sz w:val="20"/>
-        </w:rPr>
-        <w:t xml:space="preserve"> is a student of Computer Science and Engineering. His research interests include intelligent transportation systems, real-time web applications, and signal processing for vehicular networks. He led the software implementation and GPS filter design for the Syntrix V2X project.</w:t>
-      </w:r>
-    </w:p>
-    <w:p>
-      <w:pPr>
-        <w:spacing w:after="80" w:line="240" w:lineRule="auto"/>
-        <w:ind w:firstLine="216"/>
-        <w:jc w:val="both"/>
-      </w:pPr>
-      <w:r>
-        <w:rPr>
-          <w:rFonts w:ascii="Times New Roman" w:hAnsi="Times New Roman"/>
-          <w:b/>
-          <w:sz w:val="20"/>
-        </w:rPr>
-        <w:t>Vishal</w:t>
-      </w:r>
-      <w:r>
-        <w:rPr>
-          <w:rFonts w:ascii="Times New Roman" w:hAnsi="Times New Roman"/>
-          <w:sz w:val="20"/>
-        </w:rPr>
-        <w:t xml:space="preserve"> is a student of Computer Science and Engineering with interests in cloud computing, web-based distributed systems, and V2X communications. He contributed to the system architecture design, Firebase backend, and C-V2X resource allocation analysis for this project.</w:t>
-      </w:r>
     </w:p>
     <w:sectPr>
       <w:type w:val="continuous"/>

</xml_diff>